<commit_message>
chore: refresh generated prospectus and DOCX evidence
</commit_message>
<xml_diff>
--- a/examples/generated/united-capital-diamond/prospectus-draft.docx
+++ b/examples/generated/united-capital-diamond/prospectus-draft.docx
@@ -45,6 +45,7 @@
       <w:tr>
         <w:trPr>
           <w:tblHeader/>
+          <w:cantSplit/>
         </w:trPr>
         <w:tc>
           <w:tcPr>
@@ -94,6 +95,9 @@
         </w:tc>
       </w:tr>
       <w:tr>
+        <w:trPr>
+          <w:cantSplit/>
+        </w:trPr>
         <w:tc>
           <w:tcPr>
             <w:tcW w:w="3000" w:type="dxa"/>
@@ -136,6 +140,9 @@
         </w:tc>
       </w:tr>
       <w:tr>
+        <w:trPr>
+          <w:cantSplit/>
+        </w:trPr>
         <w:tc>
           <w:tcPr>
             <w:tcW w:w="3000" w:type="dxa"/>
@@ -178,6 +185,9 @@
         </w:tc>
       </w:tr>
       <w:tr>
+        <w:trPr>
+          <w:cantSplit/>
+        </w:trPr>
         <w:tc>
           <w:tcPr>
             <w:tcW w:w="3000" w:type="dxa"/>
@@ -220,6 +230,9 @@
         </w:tc>
       </w:tr>
       <w:tr>
+        <w:trPr>
+          <w:cantSplit/>
+        </w:trPr>
         <w:tc>
           <w:tcPr>
             <w:tcW w:w="3000" w:type="dxa"/>
@@ -262,6 +275,9 @@
         </w:tc>
       </w:tr>
       <w:tr>
+        <w:trPr>
+          <w:cantSplit/>
+        </w:trPr>
         <w:tc>
           <w:tcPr>
             <w:tcW w:w="3000" w:type="dxa"/>
@@ -304,6 +320,9 @@
         </w:tc>
       </w:tr>
       <w:tr>
+        <w:trPr>
+          <w:cantSplit/>
+        </w:trPr>
         <w:tc>
           <w:tcPr>
             <w:tcW w:w="3000" w:type="dxa"/>
@@ -533,6 +552,7 @@
       <w:tr>
         <w:trPr>
           <w:tblHeader/>
+          <w:cantSplit/>
         </w:trPr>
         <w:tc>
           <w:tcPr>
@@ -674,6 +694,9 @@
         </w:tc>
       </w:tr>
       <w:tr>
+        <w:trPr>
+          <w:cantSplit/>
+        </w:trPr>
         <w:tc>
           <w:tcPr>
             <w:tcW w:w="1500" w:type="dxa"/>
@@ -964,6 +987,7 @@
       <w:tr>
         <w:trPr>
           <w:tblHeader/>
+          <w:cantSplit/>
         </w:trPr>
         <w:tc>
           <w:tcPr>
@@ -1059,6 +1083,9 @@
         </w:tc>
       </w:tr>
       <w:tr>
+        <w:trPr>
+          <w:cantSplit/>
+        </w:trPr>
         <w:tc>
           <w:tcPr>
             <w:tcW w:w="2250" w:type="dxa"/>
@@ -1141,6 +1168,9 @@
         </w:tc>
       </w:tr>
       <w:tr>
+        <w:trPr>
+          <w:cantSplit/>
+        </w:trPr>
         <w:tc>
           <w:tcPr>
             <w:tcW w:w="2250" w:type="dxa"/>
@@ -1223,6 +1253,9 @@
         </w:tc>
       </w:tr>
       <w:tr>
+        <w:trPr>
+          <w:cantSplit/>
+        </w:trPr>
         <w:tc>
           <w:tcPr>
             <w:tcW w:w="2250" w:type="dxa"/>
@@ -1310,6 +1343,9 @@
       <w:pPr>
         <w:pStyle w:val="ListBullet"/>
       </w:pPr>
+      <w:r>
+        <w:t xml:space="preserve">• </w:t>
+      </w:r>
       <w:r>
         <w:t xml:space="preserve">Risque de perte en capital : Le capital investi n’est pas garanti et peut ne pas être intégralement restitué.</w:t>
       </w:r>
@@ -1319,6 +1355,9 @@
         <w:pStyle w:val="ListBullet"/>
       </w:pPr>
       <w:r>
+        <w:t xml:space="preserve">• </w:t>
+      </w:r>
+      <w:r>
         <w:t xml:space="preserve">Risque actions : La valeur des actions détenues peut fluctuer à la hausse comme à la baisse.</w:t>
       </w:r>
     </w:p>
@@ -1326,6 +1365,9 @@
       <w:pPr>
         <w:pStyle w:val="ListBullet"/>
       </w:pPr>
+      <w:r>
+        <w:t xml:space="preserve">• </w:t>
+      </w:r>
       <w:r>
         <w:t xml:space="preserve">Risque de taux : La valeur des instruments de taux peut diminuer en cas de variation défavorable des taux d’intérêt.</w:t>
       </w:r>
@@ -1335,6 +1377,9 @@
         <w:pStyle w:val="ListBullet"/>
       </w:pPr>
       <w:r>
+        <w:t xml:space="preserve">• </w:t>
+      </w:r>
+      <w:r>
         <w:t xml:space="preserve">Risque de crédit : La dégradation de la qualité d’un émetteur peut affecter la valeur des titres détenus.</w:t>
       </w:r>
     </w:p>
@@ -1342,6 +1387,9 @@
       <w:pPr>
         <w:pStyle w:val="ListBullet"/>
       </w:pPr>
+      <w:r>
+        <w:t xml:space="preserve">• </w:t>
+      </w:r>
       <w:r>
         <w:t xml:space="preserve">Risque de liquidité : Certains actifs peuvent être difficiles à céder rapidement dans des conditions normales de marché.</w:t>
       </w:r>
@@ -1351,6 +1399,9 @@
         <w:pStyle w:val="ListBullet"/>
       </w:pPr>
       <w:r>
+        <w:t xml:space="preserve">• </w:t>
+      </w:r>
+      <w:r>
         <w:t xml:space="preserve">Risque lié à la gestion discrétionnaire : Les choix du gestionnaire peuvent ne pas produire les résultats attendus.</w:t>
       </w:r>
     </w:p>
@@ -1358,6 +1409,9 @@
       <w:pPr>
         <w:pStyle w:val="ListBullet"/>
       </w:pPr>
+      <w:r>
+        <w:t xml:space="preserve">• </w:t>
+      </w:r>
       <w:r>
         <w:t xml:space="preserve">Risque opérationnel : Une défaillance de processus, de système ou d’un prestataire peut affecter le Fonds.</w:t>
       </w:r>
@@ -1393,6 +1447,7 @@
       <w:tr>
         <w:trPr>
           <w:tblHeader/>
+          <w:cantSplit/>
         </w:trPr>
         <w:tc>
           <w:tcPr>
@@ -1488,6 +1543,9 @@
         </w:tc>
       </w:tr>
       <w:tr>
+        <w:trPr>
+          <w:cantSplit/>
+        </w:trPr>
         <w:tc>
           <w:tcPr>
             <w:tcW w:w="2250" w:type="dxa"/>
@@ -1570,6 +1628,9 @@
         </w:tc>
       </w:tr>
       <w:tr>
+        <w:trPr>
+          <w:cantSplit/>
+        </w:trPr>
         <w:tc>
           <w:tcPr>
             <w:tcW w:w="2250" w:type="dxa"/>
@@ -1652,6 +1713,9 @@
         </w:tc>
       </w:tr>
       <w:tr>
+        <w:trPr>
+          <w:cantSplit/>
+        </w:trPr>
         <w:tc>
           <w:tcPr>
             <w:tcW w:w="2250" w:type="dxa"/>
@@ -1776,6 +1840,7 @@
       <w:tr>
         <w:trPr>
           <w:tblHeader/>
+          <w:cantSplit/>
         </w:trPr>
         <w:tc>
           <w:tcPr>
@@ -1917,6 +1982,9 @@
         </w:tc>
       </w:tr>
       <w:tr>
+        <w:trPr>
+          <w:cantSplit/>
+        </w:trPr>
         <w:tc>
           <w:tcPr>
             <w:tcW w:w="1500" w:type="dxa"/>
@@ -2039,6 +2107,9 @@
         </w:tc>
       </w:tr>
       <w:tr>
+        <w:trPr>
+          <w:cantSplit/>
+        </w:trPr>
         <w:tc>
           <w:tcPr>
             <w:tcW w:w="1500" w:type="dxa"/>
@@ -2161,6 +2232,9 @@
         </w:tc>
       </w:tr>
       <w:tr>
+        <w:trPr>
+          <w:cantSplit/>
+        </w:trPr>
         <w:tc>
           <w:tcPr>
             <w:tcW w:w="1500" w:type="dxa"/>
@@ -2283,6 +2357,9 @@
         </w:tc>
       </w:tr>
       <w:tr>
+        <w:trPr>
+          <w:cantSplit/>
+        </w:trPr>
         <w:tc>
           <w:tcPr>
             <w:tcW w:w="1500" w:type="dxa"/>
@@ -2405,6 +2482,9 @@
         </w:tc>
       </w:tr>
       <w:tr>
+        <w:trPr>
+          <w:cantSplit/>
+        </w:trPr>
         <w:tc>
           <w:tcPr>
             <w:tcW w:w="1500" w:type="dxa"/>
@@ -2527,6 +2607,9 @@
         </w:tc>
       </w:tr>
       <w:tr>
+        <w:trPr>
+          <w:cantSplit/>
+        </w:trPr>
         <w:tc>
           <w:tcPr>
             <w:tcW w:w="1500" w:type="dxa"/>
@@ -2649,6 +2732,9 @@
         </w:tc>
       </w:tr>
       <w:tr>
+        <w:trPr>
+          <w:cantSplit/>
+        </w:trPr>
         <w:tc>
           <w:tcPr>
             <w:tcW w:w="1500" w:type="dxa"/>
@@ -2771,6 +2857,9 @@
         </w:tc>
       </w:tr>
       <w:tr>
+        <w:trPr>
+          <w:cantSplit/>
+        </w:trPr>
         <w:tc>
           <w:tcPr>
             <w:tcW w:w="1500" w:type="dxa"/>
@@ -2893,6 +2982,9 @@
         </w:tc>
       </w:tr>
       <w:tr>
+        <w:trPr>
+          <w:cantSplit/>
+        </w:trPr>
         <w:tc>
           <w:tcPr>
             <w:tcW w:w="1500" w:type="dxa"/>
@@ -3135,6 +3227,7 @@
       <w:tr>
         <w:trPr>
           <w:tblHeader/>
+          <w:cantSplit/>
         </w:trPr>
         <w:tc>
           <w:tcPr>
@@ -3230,6 +3323,9 @@
         </w:tc>
       </w:tr>
       <w:tr>
+        <w:trPr>
+          <w:cantSplit/>
+        </w:trPr>
         <w:tc>
           <w:tcPr>
             <w:tcW w:w="2250" w:type="dxa"/>
@@ -3390,6 +3486,7 @@
       <w:tr>
         <w:trPr>
           <w:tblHeader/>
+          <w:cantSplit/>
         </w:trPr>
         <w:tc>
           <w:tcPr>
@@ -3485,6 +3582,9 @@
         </w:tc>
       </w:tr>
       <w:tr>
+        <w:trPr>
+          <w:cantSplit/>
+        </w:trPr>
         <w:tc>
           <w:tcPr>
             <w:tcW w:w="2250" w:type="dxa"/>
@@ -3567,6 +3667,9 @@
         </w:tc>
       </w:tr>
       <w:tr>
+        <w:trPr>
+          <w:cantSplit/>
+        </w:trPr>
         <w:tc>
           <w:tcPr>
             <w:tcW w:w="2250" w:type="dxa"/>
@@ -3687,6 +3790,7 @@
       <w:tr>
         <w:trPr>
           <w:tblHeader/>
+          <w:cantSplit/>
         </w:trPr>
         <w:tc>
           <w:tcPr>
@@ -3805,6 +3909,9 @@
         </w:tc>
       </w:tr>
       <w:tr>
+        <w:trPr>
+          <w:cantSplit/>
+        </w:trPr>
         <w:tc>
           <w:tcPr>
             <w:tcW w:w="1300" w:type="dxa"/>
@@ -3907,6 +4014,9 @@
         </w:tc>
       </w:tr>
       <w:tr>
+        <w:trPr>
+          <w:cantSplit/>
+        </w:trPr>
         <w:tc>
           <w:tcPr>
             <w:tcW w:w="1300" w:type="dxa"/>
@@ -4009,6 +4119,9 @@
         </w:tc>
       </w:tr>
       <w:tr>
+        <w:trPr>
+          <w:cantSplit/>
+        </w:trPr>
         <w:tc>
           <w:tcPr>
             <w:tcW w:w="1300" w:type="dxa"/>
@@ -4111,6 +4224,9 @@
         </w:tc>
       </w:tr>
       <w:tr>
+        <w:trPr>
+          <w:cantSplit/>
+        </w:trPr>
         <w:tc>
           <w:tcPr>
             <w:tcW w:w="1300" w:type="dxa"/>
@@ -4213,6 +4329,9 @@
         </w:tc>
       </w:tr>
       <w:tr>
+        <w:trPr>
+          <w:cantSplit/>
+        </w:trPr>
         <w:tc>
           <w:tcPr>
             <w:tcW w:w="1300" w:type="dxa"/>
@@ -4315,6 +4434,9 @@
         </w:tc>
       </w:tr>
       <w:tr>
+        <w:trPr>
+          <w:cantSplit/>
+        </w:trPr>
         <w:tc>
           <w:tcPr>
             <w:tcW w:w="1300" w:type="dxa"/>
@@ -4417,6 +4539,9 @@
         </w:tc>
       </w:tr>
       <w:tr>
+        <w:trPr>
+          <w:cantSplit/>
+        </w:trPr>
         <w:tc>
           <w:tcPr>
             <w:tcW w:w="1300" w:type="dxa"/>
@@ -4519,6 +4644,9 @@
         </w:tc>
       </w:tr>
       <w:tr>
+        <w:trPr>
+          <w:cantSplit/>
+        </w:trPr>
         <w:tc>
           <w:tcPr>
             <w:tcW w:w="1300" w:type="dxa"/>
@@ -4621,6 +4749,9 @@
         </w:tc>
       </w:tr>
       <w:tr>
+        <w:trPr>
+          <w:cantSplit/>
+        </w:trPr>
         <w:tc>
           <w:tcPr>
             <w:tcW w:w="1300" w:type="dxa"/>
@@ -4723,6 +4854,9 @@
         </w:tc>
       </w:tr>
       <w:tr>
+        <w:trPr>
+          <w:cantSplit/>
+        </w:trPr>
         <w:tc>
           <w:tcPr>
             <w:tcW w:w="1300" w:type="dxa"/>
@@ -4825,6 +4959,9 @@
         </w:tc>
       </w:tr>
       <w:tr>
+        <w:trPr>
+          <w:cantSplit/>
+        </w:trPr>
         <w:tc>
           <w:tcPr>
             <w:tcW w:w="1300" w:type="dxa"/>
@@ -4927,6 +5064,9 @@
         </w:tc>
       </w:tr>
       <w:tr>
+        <w:trPr>
+          <w:cantSplit/>
+        </w:trPr>
         <w:tc>
           <w:tcPr>
             <w:tcW w:w="1300" w:type="dxa"/>
@@ -5029,6 +5169,9 @@
         </w:tc>
       </w:tr>
       <w:tr>
+        <w:trPr>
+          <w:cantSplit/>
+        </w:trPr>
         <w:tc>
           <w:tcPr>
             <w:tcW w:w="1300" w:type="dxa"/>
@@ -5131,6 +5274,9 @@
         </w:tc>
       </w:tr>
       <w:tr>
+        <w:trPr>
+          <w:cantSplit/>
+        </w:trPr>
         <w:tc>
           <w:tcPr>
             <w:tcW w:w="1300" w:type="dxa"/>
@@ -5233,6 +5379,9 @@
         </w:tc>
       </w:tr>
       <w:tr>
+        <w:trPr>
+          <w:cantSplit/>
+        </w:trPr>
         <w:tc>
           <w:tcPr>
             <w:tcW w:w="1300" w:type="dxa"/>
@@ -5335,6 +5484,9 @@
         </w:tc>
       </w:tr>
       <w:tr>
+        <w:trPr>
+          <w:cantSplit/>
+        </w:trPr>
         <w:tc>
           <w:tcPr>
             <w:tcW w:w="1300" w:type="dxa"/>
@@ -5437,6 +5589,9 @@
         </w:tc>
       </w:tr>
       <w:tr>
+        <w:trPr>
+          <w:cantSplit/>
+        </w:trPr>
         <w:tc>
           <w:tcPr>
             <w:tcW w:w="1300" w:type="dxa"/>
@@ -5539,6 +5694,9 @@
         </w:tc>
       </w:tr>
       <w:tr>
+        <w:trPr>
+          <w:cantSplit/>
+        </w:trPr>
         <w:tc>
           <w:tcPr>
             <w:tcW w:w="1300" w:type="dxa"/>
@@ -5641,6 +5799,9 @@
         </w:tc>
       </w:tr>
       <w:tr>
+        <w:trPr>
+          <w:cantSplit/>
+        </w:trPr>
         <w:tc>
           <w:tcPr>
             <w:tcW w:w="1300" w:type="dxa"/>
@@ -5743,6 +5904,9 @@
         </w:tc>
       </w:tr>
       <w:tr>
+        <w:trPr>
+          <w:cantSplit/>
+        </w:trPr>
         <w:tc>
           <w:tcPr>
             <w:tcW w:w="1300" w:type="dxa"/>
@@ -5845,6 +6009,9 @@
         </w:tc>
       </w:tr>
       <w:tr>
+        <w:trPr>
+          <w:cantSplit/>
+        </w:trPr>
         <w:tc>
           <w:tcPr>
             <w:tcW w:w="1300" w:type="dxa"/>
@@ -5947,6 +6114,9 @@
         </w:tc>
       </w:tr>
       <w:tr>
+        <w:trPr>
+          <w:cantSplit/>
+        </w:trPr>
         <w:tc>
           <w:tcPr>
             <w:tcW w:w="1300" w:type="dxa"/>
@@ -6049,6 +6219,9 @@
         </w:tc>
       </w:tr>
       <w:tr>
+        <w:trPr>
+          <w:cantSplit/>
+        </w:trPr>
         <w:tc>
           <w:tcPr>
             <w:tcW w:w="1300" w:type="dxa"/>
@@ -6151,6 +6324,9 @@
         </w:tc>
       </w:tr>
       <w:tr>
+        <w:trPr>
+          <w:cantSplit/>
+        </w:trPr>
         <w:tc>
           <w:tcPr>
             <w:tcW w:w="1300" w:type="dxa"/>
@@ -6253,6 +6429,9 @@
         </w:tc>
       </w:tr>
       <w:tr>
+        <w:trPr>
+          <w:cantSplit/>
+        </w:trPr>
         <w:tc>
           <w:tcPr>
             <w:tcW w:w="1300" w:type="dxa"/>
@@ -6355,6 +6534,9 @@
         </w:tc>
       </w:tr>
       <w:tr>
+        <w:trPr>
+          <w:cantSplit/>
+        </w:trPr>
         <w:tc>
           <w:tcPr>
             <w:tcW w:w="1300" w:type="dxa"/>
@@ -6457,6 +6639,9 @@
         </w:tc>
       </w:tr>
       <w:tr>
+        <w:trPr>
+          <w:cantSplit/>
+        </w:trPr>
         <w:tc>
           <w:tcPr>
             <w:tcW w:w="1300" w:type="dxa"/>
@@ -6559,6 +6744,9 @@
         </w:tc>
       </w:tr>
       <w:tr>
+        <w:trPr>
+          <w:cantSplit/>
+        </w:trPr>
         <w:tc>
           <w:tcPr>
             <w:tcW w:w="1300" w:type="dxa"/>
@@ -6661,6 +6849,9 @@
         </w:tc>
       </w:tr>
       <w:tr>
+        <w:trPr>
+          <w:cantSplit/>
+        </w:trPr>
         <w:tc>
           <w:tcPr>
             <w:tcW w:w="1300" w:type="dxa"/>
@@ -6763,6 +6954,9 @@
         </w:tc>
       </w:tr>
       <w:tr>
+        <w:trPr>
+          <w:cantSplit/>
+        </w:trPr>
         <w:tc>
           <w:tcPr>
             <w:tcW w:w="1300" w:type="dxa"/>
@@ -6865,6 +7059,9 @@
         </w:tc>
       </w:tr>
       <w:tr>
+        <w:trPr>
+          <w:cantSplit/>
+        </w:trPr>
         <w:tc>
           <w:tcPr>
             <w:tcW w:w="1300" w:type="dxa"/>
@@ -6967,6 +7164,9 @@
         </w:tc>
       </w:tr>
       <w:tr>
+        <w:trPr>
+          <w:cantSplit/>
+        </w:trPr>
         <w:tc>
           <w:tcPr>
             <w:tcW w:w="1300" w:type="dxa"/>
@@ -7069,6 +7269,9 @@
         </w:tc>
       </w:tr>
       <w:tr>
+        <w:trPr>
+          <w:cantSplit/>
+        </w:trPr>
         <w:tc>
           <w:tcPr>
             <w:tcW w:w="1300" w:type="dxa"/>
@@ -7171,6 +7374,9 @@
         </w:tc>
       </w:tr>
       <w:tr>
+        <w:trPr>
+          <w:cantSplit/>
+        </w:trPr>
         <w:tc>
           <w:tcPr>
             <w:tcW w:w="1300" w:type="dxa"/>
@@ -7273,6 +7479,9 @@
         </w:tc>
       </w:tr>
       <w:tr>
+        <w:trPr>
+          <w:cantSplit/>
+        </w:trPr>
         <w:tc>
           <w:tcPr>
             <w:tcW w:w="1300" w:type="dxa"/>
@@ -7375,6 +7584,9 @@
         </w:tc>
       </w:tr>
       <w:tr>
+        <w:trPr>
+          <w:cantSplit/>
+        </w:trPr>
         <w:tc>
           <w:tcPr>
             <w:tcW w:w="1300" w:type="dxa"/>
@@ -7477,6 +7689,9 @@
         </w:tc>
       </w:tr>
       <w:tr>
+        <w:trPr>
+          <w:cantSplit/>
+        </w:trPr>
         <w:tc>
           <w:tcPr>
             <w:tcW w:w="1300" w:type="dxa"/>
@@ -7579,6 +7794,9 @@
         </w:tc>
       </w:tr>
       <w:tr>
+        <w:trPr>
+          <w:cantSplit/>
+        </w:trPr>
         <w:tc>
           <w:tcPr>
             <w:tcW w:w="1300" w:type="dxa"/>
@@ -7681,6 +7899,9 @@
         </w:tc>
       </w:tr>
       <w:tr>
+        <w:trPr>
+          <w:cantSplit/>
+        </w:trPr>
         <w:tc>
           <w:tcPr>
             <w:tcW w:w="1300" w:type="dxa"/>
@@ -7783,6 +8004,9 @@
         </w:tc>
       </w:tr>
       <w:tr>
+        <w:trPr>
+          <w:cantSplit/>
+        </w:trPr>
         <w:tc>
           <w:tcPr>
             <w:tcW w:w="1300" w:type="dxa"/>
@@ -7885,6 +8109,9 @@
         </w:tc>
       </w:tr>
       <w:tr>
+        <w:trPr>
+          <w:cantSplit/>
+        </w:trPr>
         <w:tc>
           <w:tcPr>
             <w:tcW w:w="1300" w:type="dxa"/>
@@ -7987,6 +8214,9 @@
         </w:tc>
       </w:tr>
       <w:tr>
+        <w:trPr>
+          <w:cantSplit/>
+        </w:trPr>
         <w:tc>
           <w:tcPr>
             <w:tcW w:w="1300" w:type="dxa"/>
@@ -8089,6 +8319,9 @@
         </w:tc>
       </w:tr>
       <w:tr>
+        <w:trPr>
+          <w:cantSplit/>
+        </w:trPr>
         <w:tc>
           <w:tcPr>
             <w:tcW w:w="1300" w:type="dxa"/>
@@ -8191,6 +8424,9 @@
         </w:tc>
       </w:tr>
       <w:tr>
+        <w:trPr>
+          <w:cantSplit/>
+        </w:trPr>
         <w:tc>
           <w:tcPr>
             <w:tcW w:w="1300" w:type="dxa"/>
@@ -8320,6 +8556,7 @@
       <w:tr>
         <w:trPr>
           <w:tblHeader/>
+          <w:cantSplit/>
         </w:trPr>
         <w:tc>
           <w:tcPr>
@@ -8369,6 +8606,9 @@
         </w:tc>
       </w:tr>
       <w:tr>
+        <w:trPr>
+          <w:cantSplit/>
+        </w:trPr>
         <w:tc>
           <w:tcPr>
             <w:tcW w:w="3000" w:type="dxa"/>
@@ -8411,6 +8651,9 @@
         </w:tc>
       </w:tr>
       <w:tr>
+        <w:trPr>
+          <w:cantSplit/>
+        </w:trPr>
         <w:tc>
           <w:tcPr>
             <w:tcW w:w="3000" w:type="dxa"/>
@@ -8453,6 +8696,9 @@
         </w:tc>
       </w:tr>
       <w:tr>
+        <w:trPr>
+          <w:cantSplit/>
+        </w:trPr>
         <w:tc>
           <w:tcPr>
             <w:tcW w:w="3000" w:type="dxa"/>
@@ -8495,6 +8741,9 @@
         </w:tc>
       </w:tr>
       <w:tr>
+        <w:trPr>
+          <w:cantSplit/>
+        </w:trPr>
         <w:tc>
           <w:tcPr>
             <w:tcW w:w="3000" w:type="dxa"/>
@@ -8537,6 +8786,9 @@
         </w:tc>
       </w:tr>
       <w:tr>
+        <w:trPr>
+          <w:cantSplit/>
+        </w:trPr>
         <w:tc>
           <w:tcPr>
             <w:tcW w:w="3000" w:type="dxa"/>
@@ -8579,6 +8831,9 @@
         </w:tc>
       </w:tr>
       <w:tr>
+        <w:trPr>
+          <w:cantSplit/>
+        </w:trPr>
         <w:tc>
           <w:tcPr>
             <w:tcW w:w="3000" w:type="dxa"/>
@@ -8621,6 +8876,9 @@
         </w:tc>
       </w:tr>
       <w:tr>
+        <w:trPr>
+          <w:cantSplit/>
+        </w:trPr>
         <w:tc>
           <w:tcPr>
             <w:tcW w:w="3000" w:type="dxa"/>
@@ -8663,6 +8921,9 @@
         </w:tc>
       </w:tr>
       <w:tr>
+        <w:trPr>
+          <w:cantSplit/>
+        </w:trPr>
         <w:tc>
           <w:tcPr>
             <w:tcW w:w="3000" w:type="dxa"/>

</xml_diff>